<commit_message>
entered new data through pipeline and developed new models based on more current data
</commit_message>
<xml_diff>
--- a/documentation/01_eda_notes.docx
+++ b/documentation/01_eda_notes.docx
@@ -138,7 +138,7 @@
                 <w:sz w:val="20"/>
                 <w:szCs w:val="20"/>
               </w:rPr>
-              <w:t xml:space="preserve">FedEx_ShipmentDetail.xlsx — 53,014 shipments × 65 features</w:t>
+              <w:t>2years.csv — 57,600 shipments × 66 features (invoice months 2024-04 through 2026-04)</w:t>
             </w:r>
           </w:p>
         </w:tc>
@@ -418,7 +418,7 @@
                 <w:sz w:val="20"/>
                 <w:szCs w:val="20"/>
               </w:rPr>
-              <w:t xml:space="preserve">March 2026  |  CSE 4309 Semester Project</w:t>
+              <w:t>April 2026  |  CSE 4309 Semester Project  |  Re-run on 2-year dataset</w:t>
             </w:r>
           </w:p>
         </w:tc>
@@ -739,7 +739,7 @@
           <w:sz w:val="22"/>
           <w:szCs w:val="22"/>
         </w:rPr>
-        <w:t xml:space="preserve">The data is a spreadsheet of 53,014 FedEx shipments exported directly from the invoicing system of a mattress manufacturing company. Each row is one shipment. There are 65 columns describing dimensions, weight, service type, pricing zone, charges, and discounts.</w:t>
+        <w:t>The data is a CSV of 57,600 FedEx shipments (file: 2years.csv) covering invoice months April 2024 through April 2026 — two full years of shipping activity from the mattress manufacturing company's FedEx invoicing system. Each row is one shipment. There are 66 columns describing dimensions, weight, service type, pricing zone, charges, and discounts. Dimensions in this export are recorded in centimeters and are converted to inches in preprocessing so that the FedEx domestic DIM divisor of 139 (in³/lb) stays valid.</w:t>
       </w:r>
     </w:p>
     <w:p>
@@ -1583,7 +1583,7 @@
                 <w:sz w:val="20"/>
                 <w:szCs w:val="20"/>
               </w:rPr>
-              <w:t xml:space="preserve">99.9%</w:t>
+              <w:t>98.4%</w:t>
             </w:r>
           </w:p>
         </w:tc>
@@ -1687,7 +1687,7 @@
                 <w:sz w:val="20"/>
                 <w:szCs w:val="20"/>
               </w:rPr>
-              <w:t xml:space="preserve">100.0%</w:t>
+              <w:t>100.0%</w:t>
             </w:r>
           </w:p>
         </w:tc>
@@ -1791,7 +1791,7 @@
                 <w:sz w:val="20"/>
                 <w:szCs w:val="20"/>
               </w:rPr>
-              <w:t xml:space="preserve">99.2%</w:t>
+              <w:t>99.3%</w:t>
             </w:r>
           </w:p>
         </w:tc>
@@ -2064,7 +2064,7 @@
                 <w:sz w:val="20"/>
                 <w:szCs w:val="20"/>
               </w:rPr>
-              <w:t xml:space="preserve">Always 'lb'</w:t>
+              <w:t>Effectively always 'lb' (57,329 of 57,330 rows; 1 stray 'kg' row)</w:t>
             </w:r>
           </w:p>
         </w:tc>
@@ -2376,7 +2376,7 @@
                 <w:sz w:val="20"/>
                 <w:szCs w:val="20"/>
               </w:rPr>
-              <w:t xml:space="preserve">99.8% Domestic</w:t>
+              <w:t>99.7% Domestic</w:t>
             </w:r>
           </w:p>
         </w:tc>
@@ -2410,7 +2410,7 @@
                 <w:sz w:val="20"/>
                 <w:szCs w:val="20"/>
               </w:rPr>
-              <w:t xml:space="preserve">Drop — 90 international rows excluded in preprocessing</w:t>
+              <w:t>Drop — 176 international rows excluded in preprocessing</w:t>
             </w:r>
           </w:p>
         </w:tc>
@@ -2904,7 +2904,7 @@
                 <w:sz w:val="20"/>
                 <w:szCs w:val="20"/>
               </w:rPr>
-              <w:t xml:space="preserve">31,152</w:t>
+              <w:t>38,958</w:t>
             </w:r>
           </w:p>
         </w:tc>
@@ -2938,7 +2938,7 @@
                 <w:sz w:val="20"/>
                 <w:szCs w:val="20"/>
               </w:rPr>
-              <w:t xml:space="preserve">59.3%</w:t>
+              <w:t>68.0%</w:t>
             </w:r>
           </w:p>
         </w:tc>
@@ -3042,7 +3042,7 @@
                 <w:sz w:val="20"/>
                 <w:szCs w:val="20"/>
               </w:rPr>
-              <w:t xml:space="preserve">21,377</w:t>
+              <w:t>18,372</w:t>
             </w:r>
           </w:p>
         </w:tc>
@@ -3076,7 +3076,7 @@
                 <w:sz w:val="20"/>
                 <w:szCs w:val="20"/>
               </w:rPr>
-              <w:t xml:space="preserve">40.7%</w:t>
+              <w:t>32.0%</w:t>
             </w:r>
           </w:p>
         </w:tc>
@@ -3180,7 +3180,7 @@
                 <w:sz w:val="20"/>
                 <w:szCs w:val="20"/>
               </w:rPr>
-              <w:t xml:space="preserve">52,529</w:t>
+              <w:t>57,330</w:t>
             </w:r>
           </w:p>
         </w:tc>
@@ -3214,7 +3214,7 @@
                 <w:sz w:val="20"/>
                 <w:szCs w:val="20"/>
               </w:rPr>
-              <w:t xml:space="preserve">100%</w:t>
+              <w:t>100%</w:t>
             </w:r>
           </w:p>
         </w:tc>
@@ -3248,7 +3248,7 @@
                 <w:sz w:val="20"/>
                 <w:szCs w:val="20"/>
               </w:rPr>
-              <w:t xml:space="preserve">Ratio 1.46:1</w:t>
+              <w:t>Ratio 2.12:1</w:t>
             </w:r>
           </w:p>
         </w:tc>
@@ -3273,7 +3273,7 @@
           <w:sz w:val="22"/>
           <w:szCs w:val="22"/>
         </w:rPr>
-        <w:t xml:space="preserve">A 60/40 class split is considered mild imbalance. In machine learning, perfectly balanced classes (50/50) are ideal. At 40%, the minority class is still well-represented and manageable.</w:t>
+        <w:t>A 68/32 class split is more imbalanced than the prior 3-year export but still considered mild. At 32%, the minority class (DIM=Y) is still well-represented and manageable with standard class weighting.</w:t>
       </w:r>
     </w:p>
     <w:p>
@@ -3371,7 +3371,7 @@
           <w:sz w:val="26"/>
           <w:szCs w:val="26"/>
         </w:rPr>
-        <w:t xml:space="preserve">4.3  The 485 Null DIM Rows</w:t>
+        <w:t>270 rows had no DIM flag value at all. Investigation showed every single one was labeled Service Type = 'NonTrans' — these are non-transport billing entries (fuel surcharges, adjustments) billed as separate line items. They are not actual shipments and were removed before any analysis.</w:t>
       </w:r>
     </w:p>
     <w:p>
@@ -3861,7 +3861,7 @@
                 <w:sz w:val="20"/>
                 <w:szCs w:val="20"/>
               </w:rPr>
-              <w:t xml:space="preserve">0.8489</w:t>
+              <w:t>0.8951</w:t>
             </w:r>
           </w:p>
         </w:tc>
@@ -3965,7 +3965,7 @@
                 <w:sz w:val="20"/>
                 <w:szCs w:val="20"/>
               </w:rPr>
-              <w:t xml:space="preserve">0.9056</w:t>
+              <w:t>0.9430</w:t>
             </w:r>
           </w:p>
         </w:tc>
@@ -4024,7 +4024,7 @@
           <w:sz w:val="22"/>
           <w:szCs w:val="22"/>
         </w:rPr>
-        <w:t xml:space="preserve">Note: The raw roc_auc_score for rated weight printed as 0.1511 because the relationship is inverted — DIM=Y packages have lower rated weight than DIM=N packages on average. An AUC below 0.5 means the feature is predictive in the negative direction. The effective AUC is 1 − 0.1511 = 0.8489.</w:t>
+        <w:t>Note: The raw roc_auc_score for rated weight printed as 0.1049 because the relationship is inverted — DIM=Y packages have lower rated weight than DIM=N packages on average. An AUC below 0.5 means the feature is predictive in the negative direction. The effective AUC is 1 − 0.1049 = 0.8951.</w:t>
       </w:r>
     </w:p>
     <w:p>
@@ -4046,7 +4046,7 @@
           <w:sz w:val="22"/>
           <w:szCs w:val="22"/>
         </w:rPr>
-        <w:t xml:space="preserve">Actual weight outperforms rated weight as a predictor (0.9056 vs 0.8489). This makes physical sense: light packages are very likely to be DIM-flagged because their volume is large relative to their weight. The signal is in actual weight, not rated weight.</w:t>
+        <w:t>Actual weight outperforms rated weight as a predictor (0.9430 vs 0.8951). This makes physical sense: light packages are very likely to be DIM-flagged because their volume is large relative to their weight. The signal is in actual weight, not rated weight. Both features are stronger in the 2-year dataset than they were in the prior 3-year export, consistent with a more consistent shipping mix.</w:t>
       </w:r>
     </w:p>
     <w:p>
@@ -4751,7 +4751,7 @@
           <w:sz w:val="22"/>
           <w:szCs w:val="22"/>
         </w:rPr>
-        <w:t xml:space="preserve">493 shipments (0.9%) had at least one dimension recorded as zero, which is physically impossible for a real package. Breakdown:</w:t>
+        <w:t>616 shipments (1.1%) had at least one dimension recorded as zero, which is physically impossible for a real package. Breakdown:</w:t>
       </w:r>
     </w:p>
     <w:p>
@@ -4772,7 +4772,7 @@
           <w:sz w:val="22"/>
           <w:szCs w:val="22"/>
         </w:rPr>
-        <w:t xml:space="preserve">490 were DIM=N — kept, but volume / dim_weight_ratio set to 0. A binary indicator column has_dimensions (0 or 1) is added so models know these rows are missing dimension data.</w:t>
+        <w:t>All 616 were DIM=N — kept, but volume / dim_weight_ratio set to 0. A binary indicator column has_dimensions (0 or 1) is added so models know these rows are missing dimension data.</w:t>
       </w:r>
     </w:p>
     <w:p>
@@ -4793,7 +4793,7 @@
           <w:sz w:val="22"/>
           <w:szCs w:val="22"/>
         </w:rPr>
-        <w:t xml:space="preserve">3 were DIM=Y — impossible to have a DIM flag with zero dimensions. These are data entry errors and are dropped.</w:t>
+        <w:t>0 were DIM=Y — unlike the prior export, the new dataset has no DIM=Y rows with zero dimensions, so the data-error filter removes nothing. The filter is retained for safety.</w:t>
       </w:r>
     </w:p>
     <w:p>
@@ -5009,7 +5009,7 @@
                 <w:sz w:val="20"/>
                 <w:szCs w:val="20"/>
               </w:rPr>
-              <w:t xml:space="preserve">52,529 shipments</w:t>
+              <w:t>57,330 shipments</w:t>
             </w:r>
           </w:p>
         </w:tc>
@@ -5079,7 +5079,7 @@
                 <w:sz w:val="20"/>
                 <w:szCs w:val="20"/>
               </w:rPr>
-              <w:t xml:space="preserve">$58.87</w:t>
+              <w:t>$56.04</w:t>
             </w:r>
           </w:p>
         </w:tc>
@@ -5149,7 +5149,7 @@
                 <w:sz w:val="20"/>
                 <w:szCs w:val="20"/>
               </w:rPr>
-              <w:t xml:space="preserve">$55.60</w:t>
+              <w:t>$52.61</w:t>
             </w:r>
           </w:p>
         </w:tc>
@@ -5219,7 +5219,7 @@
                 <w:sz w:val="20"/>
                 <w:szCs w:val="20"/>
               </w:rPr>
-              <w:t xml:space="preserve">$42.39</w:t>
+              <w:t>$43.53</w:t>
             </w:r>
           </w:p>
         </w:tc>
@@ -5289,7 +5289,7 @@
                 <w:sz w:val="20"/>
                 <w:szCs w:val="20"/>
               </w:rPr>
-              <w:t xml:space="preserve">$0.00  (8 shipments with zero charge — investigate in preprocessing)</w:t>
+              <w:t>$0.00  (23 shipments with zero charge — investigate in preprocessing)</w:t>
             </w:r>
           </w:p>
         </w:tc>
@@ -5359,7 +5359,7 @@
                 <w:sz w:val="20"/>
                 <w:szCs w:val="20"/>
               </w:rPr>
-              <w:t xml:space="preserve">$3,501.76</w:t>
+              <w:t>$2,721.66</w:t>
             </w:r>
           </w:p>
         </w:tc>
@@ -5429,7 +5429,7 @@
                 <w:sz w:val="20"/>
                 <w:szCs w:val="20"/>
               </w:rPr>
-              <w:t xml:space="preserve">23.212  ← extreme right skew</w:t>
+              <w:t>23.152  ← extreme right skew (essentially unchanged)</w:t>
             </w:r>
           </w:p>
         </w:tc>
@@ -5499,7 +5499,7 @@
                 <w:sz w:val="20"/>
                 <w:szCs w:val="20"/>
               </w:rPr>
-              <w:t xml:space="preserve">53 shipments (0.1%)</w:t>
+              <w:t>60 shipments (0.1%)</w:t>
             </w:r>
           </w:p>
         </w:tc>
@@ -5677,7 +5677,7 @@
           <w:sz w:val="22"/>
           <w:szCs w:val="22"/>
         </w:rPr>
-        <w:t xml:space="preserve">DIM=N shipments cost more on average ($67.30) than DIM=Y shipments ($46.59). This seems backwards — isn't DIM billing supposed to increase costs?</w:t>
+        <w:t>DIM=N shipments cost more on average ($61.92) than DIM=Y shipments ($43.58). This seems backwards — isn't DIM billing supposed to increase costs?</w:t>
       </w:r>
     </w:p>
     <w:p>
@@ -6029,7 +6029,7 @@
                 <w:sz w:val="20"/>
                 <w:szCs w:val="20"/>
               </w:rPr>
-              <w:t xml:space="preserve">70 rows</w:t>
+              <w:t>3,599 rows</w:t>
             </w:r>
           </w:p>
         </w:tc>
@@ -6167,7 +6167,7 @@
                 <w:sz w:val="20"/>
                 <w:szCs w:val="20"/>
               </w:rPr>
-              <w:t xml:space="preserve">37 rows</w:t>
+              <w:t>7,808 rows</w:t>
             </w:r>
           </w:p>
         </w:tc>
@@ -6305,7 +6305,7 @@
                 <w:sz w:val="20"/>
                 <w:szCs w:val="20"/>
               </w:rPr>
-              <w:t xml:space="preserve">16 rows</w:t>
+              <w:t>13,096 rows</w:t>
             </w:r>
           </w:p>
         </w:tc>
@@ -6443,7 +6443,7 @@
                 <w:sz w:val="20"/>
                 <w:szCs w:val="20"/>
               </w:rPr>
-              <w:t xml:space="preserve">195 rows</w:t>
+              <w:t>9,597 rows</w:t>
             </w:r>
           </w:p>
         </w:tc>
@@ -6581,7 +6581,7 @@
                 <w:sz w:val="20"/>
                 <w:szCs w:val="20"/>
               </w:rPr>
-              <w:t xml:space="preserve">17 rows</w:t>
+              <w:t>7,235 rows</w:t>
             </w:r>
           </w:p>
         </w:tc>
@@ -6719,7 +6719,7 @@
                 <w:sz w:val="20"/>
                 <w:szCs w:val="20"/>
               </w:rPr>
-              <w:t xml:space="preserve">162 rows</w:t>
+              <w:t>13,827 rows</w:t>
             </w:r>
           </w:p>
         </w:tc>
@@ -6857,7 +6857,7 @@
                 <w:sz w:val="20"/>
                 <w:szCs w:val="20"/>
               </w:rPr>
-              <w:t xml:space="preserve">~80 rows total</w:t>
+              <w:t>~500 rows total (Non Zone, 9, 51, 0, 17, etc.)</w:t>
             </w:r>
           </w:p>
         </w:tc>
@@ -7017,7 +7017,7 @@
           <w:sz w:val="22"/>
           <w:szCs w:val="22"/>
         </w:rPr>
-        <w:t xml:space="preserve">DIM rate by zone from the EDA: zones 02 and 03 had ~50% DIM rates. Zone 08 (cross-country) had only 23%. This makes sense — local deliveries are disproportionately large furniture/mattress items.</w:t>
+        <w:t>DIM rate by zone from the EDA: zone 03 has the highest rate at 42.8%, zones 05 and 06 sit around 36–39%, and zone 08 (cross-country) drops to 21.7%. This still makes sense — local deliveries are disproportionately large furniture/mattress items, while cross-country shipments include more small/dense packages.</w:t>
       </w:r>
     </w:p>
     <w:p>
@@ -7056,7 +7056,7 @@
           <w:sz w:val="22"/>
           <w:szCs w:val="22"/>
         </w:rPr>
-        <w:t xml:space="preserve">Service type showed the most dramatic variation in DIM rates:</w:t>
+        <w:t>Service type still shows meaningful variation in DIM rates, though the mix of service codes is different in the 2-year data (Return Manager and Express Saver are absent; Ground Call Tag and Ground Multiweight appear):</w:t>
       </w:r>
     </w:p>
     <w:p>
@@ -7254,7 +7254,7 @@
                 <w:sz w:val="20"/>
                 <w:szCs w:val="20"/>
               </w:rPr>
-              <w:t xml:space="preserve">QH</w:t>
+              <w:t>QH</w:t>
             </w:r>
           </w:p>
         </w:tc>
@@ -7288,7 +7288,7 @@
                 <w:sz w:val="20"/>
                 <w:szCs w:val="20"/>
               </w:rPr>
-              <w:t xml:space="preserve">Home Delivery</w:t>
+              <w:t>Home Delivery</w:t>
             </w:r>
           </w:p>
         </w:tc>
@@ -7322,7 +7322,7 @@
                 <w:sz w:val="20"/>
                 <w:szCs w:val="20"/>
               </w:rPr>
-              <w:t xml:space="preserve">67%</w:t>
+              <w:t>37.2%</w:t>
             </w:r>
           </w:p>
         </w:tc>
@@ -7356,7 +7356,7 @@
                 <w:sz w:val="20"/>
                 <w:szCs w:val="20"/>
               </w:rPr>
-              <w:t xml:space="preserve">Furniture / mattress — large light boxes</w:t>
+              <w:t>Still the biggest slice (31,086 shipments); furniture/mattress mix</w:t>
             </w:r>
           </w:p>
         </w:tc>
@@ -7392,7 +7392,7 @@
                 <w:sz w:val="20"/>
                 <w:szCs w:val="20"/>
               </w:rPr>
-              <w:t xml:space="preserve">RMGR</w:t>
+              <w:t>SG</w:t>
             </w:r>
           </w:p>
         </w:tc>
@@ -7426,7 +7426,7 @@
                 <w:sz w:val="20"/>
                 <w:szCs w:val="20"/>
               </w:rPr>
-              <w:t xml:space="preserve">Return Manager</w:t>
+              <w:t>FedEx Ground</w:t>
             </w:r>
           </w:p>
         </w:tc>
@@ -7460,7 +7460,7 @@
                 <w:sz w:val="20"/>
                 <w:szCs w:val="20"/>
               </w:rPr>
-              <w:t xml:space="preserve">76%</w:t>
+              <w:t>26.1%</w:t>
             </w:r>
           </w:p>
         </w:tc>
@@ -7494,7 +7494,7 @@
                 <w:sz w:val="20"/>
                 <w:szCs w:val="20"/>
               </w:rPr>
-              <w:t xml:space="preserve">Returns tend to be bulky repacked items</w:t>
+              <w:t>Mixed general-parcel volume (24,739 shipments); heavy items dominate</w:t>
             </w:r>
           </w:p>
         </w:tc>
@@ -7530,7 +7530,7 @@
                 <w:sz w:val="20"/>
                 <w:szCs w:val="20"/>
               </w:rPr>
-              <w:t xml:space="preserve">SG</w:t>
+              <w:t>CTAG</w:t>
             </w:r>
           </w:p>
         </w:tc>
@@ -7564,7 +7564,7 @@
                 <w:sz w:val="20"/>
                 <w:szCs w:val="20"/>
               </w:rPr>
-              <w:t xml:space="preserve">FedEx Ground</w:t>
+              <w:t>Ground Call Tag</w:t>
             </w:r>
           </w:p>
         </w:tc>
@@ -7598,7 +7598,7 @@
                 <w:sz w:val="20"/>
                 <w:szCs w:val="20"/>
               </w:rPr>
-              <w:t xml:space="preserve">26%</w:t>
+              <w:t>45.6%</w:t>
             </w:r>
           </w:p>
         </w:tc>
@@ -7632,7 +7632,7 @@
                 <w:sz w:val="20"/>
                 <w:szCs w:val="20"/>
               </w:rPr>
-              <w:t xml:space="preserve">Mix of all package types</w:t>
+              <w:t>Highest DIM rate — bulky return pickups (only 114 shipments)</w:t>
             </w:r>
           </w:p>
         </w:tc>
@@ -7668,7 +7668,7 @@
                 <w:sz w:val="20"/>
                 <w:szCs w:val="20"/>
               </w:rPr>
-              <w:t xml:space="preserve">ES</w:t>
+              <w:t>PO</w:t>
             </w:r>
           </w:p>
         </w:tc>
@@ -7702,7 +7702,7 @@
                 <w:sz w:val="20"/>
                 <w:szCs w:val="20"/>
               </w:rPr>
-              <w:t xml:space="preserve">Express Saver</w:t>
+              <w:t>Priority Overnight</w:t>
             </w:r>
           </w:p>
         </w:tc>
@@ -7736,7 +7736,7 @@
                 <w:sz w:val="20"/>
                 <w:szCs w:val="20"/>
               </w:rPr>
-              <w:t xml:space="preserve">18%</w:t>
+              <w:t>12.7%</w:t>
             </w:r>
           </w:p>
         </w:tc>
@@ -7770,7 +7770,7 @@
                 <w:sz w:val="20"/>
                 <w:szCs w:val="20"/>
               </w:rPr>
-              <w:t xml:space="preserve">Express = small docs, parts, not furniture</w:t>
+              <w:t>Express = small/dense documents &amp; parts, rarely DIM-triggered</w:t>
             </w:r>
           </w:p>
         </w:tc>
@@ -8733,7 +8733,7 @@
           <w:sz w:val="22"/>
           <w:szCs w:val="22"/>
         </w:rPr>
-        <w:t xml:space="preserve">485 NonTrans rows — no DIM flag, not real shipments</w:t>
+        <w:t>270 NonTrans rows — no DIM flag, not real shipments</w:t>
       </w:r>
     </w:p>
     <w:p>
@@ -8754,7 +8754,7 @@
           <w:sz w:val="22"/>
           <w:szCs w:val="22"/>
         </w:rPr>
-        <w:t xml:space="preserve">3 DIM=Y rows with zero dimensions — physically impossible, data errors</w:t>
+        <w:t>0 DIM=Y rows with zero dimensions — none present in the 2-year data, but the filter is retained for safety</w:t>
       </w:r>
     </w:p>
     <w:p>
@@ -8775,7 +8775,7 @@
           <w:sz w:val="22"/>
           <w:szCs w:val="22"/>
         </w:rPr>
-        <w:t xml:space="preserve">90 international shipments — out of scope for domestic model</w:t>
+        <w:t>176 international shipments — out of scope for domestic model</w:t>
       </w:r>
     </w:p>
     <w:p>
@@ -9489,22 +9489,13 @@
                 <w:sz w:val="20"/>
                 <w:szCs w:val="20"/>
               </w:rPr>
-              <w:t xml:space="preserve">For Claude Code — file to write next</w:t>
-            </w:r>
-          </w:p>
-          <w:p>
-            <w:pPr>
-              <w:spacing w:before="0" w:after="0"/>
-            </w:pPr>
-            <w:r>
-              <w:rPr>
-                <w:rFonts w:ascii="Calibri" w:cs="Calibri" w:eastAsia="Calibri" w:hAnsi="Calibri"/>
-                <w:color w:val="222222"/>
-                <w:sz w:val="20"/>
-                <w:szCs w:val="20"/>
-              </w:rPr>
-              <w:t xml:space="preserve">src/02_preprocessing.py
-This script reads FedEx_ShipmentDetail.xlsx, applies every decision in Section 10, and writes the processed splits to data/. It also saves the fitted StandardScaler and OHE encoders as models/preprocessor.pkl so they can be applied identically to new data at inference time.</w:t>
+              <w:t>For Claude Code — preprocessing target</w:t>
+              <w:br/>
+              <w:br/>
+              <w:t>src/02_preprocessing.py</w:t>
+              <w:br/>
+              <w:br/>
+              <w:t>This script reads 2years.csv, applies every decision in Section 10, and writes the processed splits to data/. It also saves the fitted StandardScaler as models/preprocessor.pkl so it can be applied identically to new data at inference time. Dimensions are converted from cm to inches during feature engineering.</w:t>
             </w:r>
           </w:p>
         </w:tc>

</xml_diff>